<commit_message>
Update in Resume and add avax transfer host link on portfolio project section
</commit_message>
<xml_diff>
--- a/Ritik Verma Blockchain Developer Resume.docx
+++ b/Ritik Verma Blockchain Developer Resume.docx
@@ -248,7 +248,7 @@
     <w:p>
       <w:pPr>
         <w:rPr>
-          <w:rFonts w:ascii="Segoe UI Emoji" w:hAnsi="Segoe UI Emoji" w:cs="Segoe UI Emoji"/>
+          <w:rFonts w:asciiTheme="majorHAnsi" w:hAnsiTheme="majorHAnsi" w:cstheme="majorHAnsi"/>
           <w:b/>
           <w:bCs/>
         </w:rPr>
@@ -348,57 +348,18 @@
           <w:bCs/>
         </w:rPr>
       </w:pPr>
-    </w:p>
-    <w:p>
-      <w:pPr>
-        <w:rPr>
-          <w:rFonts w:asciiTheme="majorHAnsi" w:hAnsiTheme="majorHAnsi" w:cstheme="majorHAnsi"/>
-          <w:b/>
-          <w:bCs/>
-        </w:rPr>
-      </w:pPr>
-      <w:r>
-        <w:rPr>
-          <w:rFonts w:ascii="Segoe UI Emoji" w:hAnsi="Segoe UI Emoji" w:cs="Segoe UI Emoji"/>
-          <w:b/>
-          <w:bCs/>
-        </w:rPr>
-        <w:t>🔹 D-Chat – Decentralized P2P Chat App</w:t>
-      </w:r>
-      <w:r>
-        <w:rPr>
-          <w:rFonts w:ascii="Segoe UI Emoji" w:hAnsi="Segoe UI Emoji" w:cs="Segoe UI Emoji"/>
-          <w:b/>
-          <w:bCs/>
-        </w:rPr>
-        <w:br/>
-      </w:r>
-      <w:r>
-        <w:rPr>
-          <w:rFonts w:asciiTheme="majorHAnsi" w:hAnsiTheme="majorHAnsi" w:cstheme="majorHAnsi"/>
-          <w:b/>
-          <w:bCs/>
-        </w:rPr>
-        <w:t xml:space="preserve">Built a fully decentralized chat application using GunDB, P2P networking, and AES-GCM end-to-end encryption. Features real-time peer-to-peer messaging, anonymous key-based identity, distributed data replication, and a privacy-focused serverless architecture. </w:t>
-      </w:r>
-    </w:p>
-    <w:p>
-      <w:pPr>
-        <w:rPr>
-          <w:rFonts w:ascii="Segoe UI Emoji" w:hAnsi="Segoe UI Emoji" w:cs="Segoe UI Emoji"/>
-          <w:b/>
-          <w:bCs/>
-        </w:rPr>
-      </w:pPr>
-      <w:r>
-        <w:rPr>
-          <w:rFonts w:ascii="Segoe UI Emoji" w:hAnsi="Segoe UI Emoji" w:cs="Segoe UI Emoji"/>
-          <w:b/>
-          <w:bCs/>
-        </w:rPr>
-        <w:t xml:space="preserve">Live: </w:t>
-      </w:r>
-      <w:hyperlink r:id="rId9" w:tgtFrame="_new" w:history="1">
+      <w:r>
+        <w:rPr>
+          <w:rFonts w:ascii="Segoe UI Emoji" w:hAnsi="Segoe UI Emoji" w:cs="Segoe UI Emoji"/>
+          <w:b/>
+          <w:bCs/>
+        </w:rPr>
+        <w:t>Live:</w:t>
+      </w:r>
+      <w:r>
+        <w:t xml:space="preserve"> </w:t>
+      </w:r>
+      <w:hyperlink r:id="rId9" w:history="1">
         <w:r>
           <w:rPr>
             <w:rStyle w:val="Hyperlink"/>
@@ -406,7 +367,170 @@
             <w:b/>
             <w:bCs/>
           </w:rPr>
-          <w:t>https:</w:t>
+          <w:t xml:space="preserve">Smart Contract Analyzer </w:t>
+        </w:r>
+        <w:proofErr w:type="spellStart"/>
+        <w:r>
+          <w:rPr>
+            <w:rStyle w:val="Hyperlink"/>
+            <w:rFonts w:ascii="Segoe UI Emoji" w:hAnsi="Segoe UI Emoji" w:cs="Segoe UI Emoji"/>
+            <w:b/>
+            <w:bCs/>
+          </w:rPr>
+          <w:t>DApp</w:t>
+        </w:r>
+        <w:proofErr w:type="spellEnd"/>
+      </w:hyperlink>
+    </w:p>
+    <w:p>
+      <w:pPr>
+        <w:rPr>
+          <w:rFonts w:ascii="Segoe UI Emoji" w:hAnsi="Segoe UI Emoji" w:cs="Segoe UI Emoji"/>
+          <w:b/>
+          <w:bCs/>
+        </w:rPr>
+      </w:pPr>
+    </w:p>
+    <w:p>
+      <w:pPr>
+        <w:rPr>
+          <w:rFonts w:asciiTheme="majorHAnsi" w:hAnsiTheme="majorHAnsi" w:cstheme="majorHAnsi"/>
+          <w:b/>
+          <w:bCs/>
+        </w:rPr>
+      </w:pPr>
+      <w:r>
+        <w:rPr>
+          <w:rFonts w:ascii="Segoe UI Emoji" w:hAnsi="Segoe UI Emoji" w:cs="Segoe UI Emoji"/>
+          <w:b/>
+          <w:bCs/>
+        </w:rPr>
+        <w:t>🔹 D-Chat – Decentralized P2P Chat App</w:t>
+      </w:r>
+      <w:r>
+        <w:rPr>
+          <w:rFonts w:ascii="Segoe UI Emoji" w:hAnsi="Segoe UI Emoji" w:cs="Segoe UI Emoji"/>
+          <w:b/>
+          <w:bCs/>
+        </w:rPr>
+        <w:br/>
+      </w:r>
+      <w:r>
+        <w:rPr>
+          <w:rFonts w:asciiTheme="majorHAnsi" w:hAnsiTheme="majorHAnsi" w:cstheme="majorHAnsi"/>
+          <w:b/>
+          <w:bCs/>
+        </w:rPr>
+        <w:t xml:space="preserve">Built a fully decentralized chat application using GunDB, P2P networking, and AES-GCM end-to-end encryption. Features real-time peer-to-peer messaging, anonymous key-based identity, distributed data replication, and a privacy-focused serverless architecture. </w:t>
+      </w:r>
+    </w:p>
+    <w:p>
+      <w:pPr>
+        <w:rPr>
+          <w:rFonts w:ascii="Segoe UI Emoji" w:hAnsi="Segoe UI Emoji" w:cs="Segoe UI Emoji"/>
+          <w:b/>
+          <w:bCs/>
+        </w:rPr>
+      </w:pPr>
+      <w:r>
+        <w:rPr>
+          <w:rFonts w:ascii="Segoe UI Emoji" w:hAnsi="Segoe UI Emoji" w:cs="Segoe UI Emoji"/>
+          <w:b/>
+          <w:bCs/>
+        </w:rPr>
+        <w:t xml:space="preserve">Live: </w:t>
+      </w:r>
+      <w:hyperlink r:id="rId10" w:tgtFrame="_new" w:history="1">
+        <w:r>
+          <w:rPr>
+            <w:rStyle w:val="Hyperlink"/>
+            <w:rFonts w:ascii="Segoe UI Emoji" w:hAnsi="Segoe UI Emoji" w:cs="Segoe UI Emoji"/>
+            <w:b/>
+            <w:bCs/>
+          </w:rPr>
+          <w:t>https://d-chat.online/</w:t>
+        </w:r>
+      </w:hyperlink>
+    </w:p>
+    <w:p>
+      <w:pPr>
+        <w:rPr>
+          <w:b/>
+          <w:bCs/>
+        </w:rPr>
+      </w:pPr>
+      <w:r>
+        <w:rPr>
+          <w:rFonts w:ascii="Segoe UI Emoji" w:hAnsi="Segoe UI Emoji" w:cs="Segoe UI Emoji"/>
+          <w:b/>
+          <w:bCs/>
+        </w:rPr>
+        <w:t>🔹</w:t>
+      </w:r>
+      <w:r>
+        <w:rPr>
+          <w:b/>
+          <w:bCs/>
+        </w:rPr>
+        <w:t xml:space="preserve"> AVAX Transfer </w:t>
+      </w:r>
+      <w:proofErr w:type="spellStart"/>
+      <w:r>
+        <w:rPr>
+          <w:b/>
+          <w:bCs/>
+        </w:rPr>
+        <w:t>DApp</w:t>
+      </w:r>
+      <w:proofErr w:type="spellEnd"/>
+    </w:p>
+    <w:p>
+      <w:r>
+        <w:t xml:space="preserve">Created a real-time AVAX transaction application using Web3.js and Ethers.js. Displays sender/receiver balances, gas fee, and </w:t>
+      </w:r>
+      <w:proofErr w:type="spellStart"/>
+      <w:r>
+        <w:t>Snowtrace</w:t>
+      </w:r>
+      <w:proofErr w:type="spellEnd"/>
+      <w:r>
+        <w:t xml:space="preserve"> link with transaction history. Built on the Avalanche Fuji </w:t>
+      </w:r>
+      <w:proofErr w:type="spellStart"/>
+      <w:r>
+        <w:t>Testnet</w:t>
+      </w:r>
+      <w:proofErr w:type="spellEnd"/>
+      <w:r>
+        <w:t>.</w:t>
+      </w:r>
+    </w:p>
+    <w:p>
+      <w:r>
+        <w:rPr>
+          <w:rFonts w:ascii="Segoe UI Emoji" w:hAnsi="Segoe UI Emoji" w:cs="Segoe UI Emoji"/>
+          <w:b/>
+          <w:bCs/>
+        </w:rPr>
+        <w:t>Live:</w:t>
+      </w:r>
+      <w:r>
+        <w:rPr>
+          <w:rFonts w:ascii="Segoe UI Emoji" w:hAnsi="Segoe UI Emoji" w:cs="Segoe UI Emoji"/>
+          <w:b/>
+          <w:bCs/>
+        </w:rPr>
+        <w:t xml:space="preserve"> </w:t>
+      </w:r>
+      <w:hyperlink r:id="rId11" w:history="1">
+        <w:r>
+          <w:rPr>
+            <w:rStyle w:val="Hyperlink"/>
+            <w:rFonts w:ascii="Segoe UI Emoji" w:hAnsi="Segoe UI Emoji" w:cs="Segoe UI Emoji"/>
+            <w:b/>
+            <w:bCs/>
+          </w:rPr>
+          <w:t>AVAX Transfer Reac</w:t>
         </w:r>
         <w:r>
           <w:rPr>
@@ -415,7 +539,7 @@
             <w:b/>
             <w:bCs/>
           </w:rPr>
-          <w:t>/</w:t>
+          <w:t>t</w:t>
         </w:r>
         <w:r>
           <w:rPr>
@@ -424,7 +548,7 @@
             <w:b/>
             <w:bCs/>
           </w:rPr>
-          <w:t>/d-chat.online/</w:t>
+          <w:t xml:space="preserve"> App</w:t>
         </w:r>
       </w:hyperlink>
     </w:p>
@@ -448,7 +572,7 @@
           <w:b/>
           <w:bCs/>
         </w:rPr>
-        <w:t xml:space="preserve"> AVAX Transfer </w:t>
+        <w:t xml:space="preserve"> Lottery </w:t>
       </w:r>
       <w:proofErr w:type="spellStart"/>
       <w:r>
@@ -462,23 +586,40 @@
     </w:p>
     <w:p>
       <w:r>
-        <w:t xml:space="preserve">Created a real-time AVAX transaction application using Web3.js and Ethers.js. Displays sender/receiver balances, gas fee, and </w:t>
-      </w:r>
+        <w:t>Smart contract-powered lottery system where users buy tickets and a random winner is selected. Includes live wallet interaction and on-chain logic.</w:t>
+      </w:r>
+    </w:p>
+    <w:p>
+      <w:pPr>
+        <w:rPr>
+          <w:b/>
+          <w:bCs/>
+        </w:rPr>
+      </w:pPr>
+      <w:r>
+        <w:rPr>
+          <w:rFonts w:ascii="Segoe UI Emoji" w:hAnsi="Segoe UI Emoji" w:cs="Segoe UI Emoji"/>
+          <w:b/>
+          <w:bCs/>
+        </w:rPr>
+        <w:t>🔹</w:t>
+      </w:r>
+      <w:r>
+        <w:rPr>
+          <w:b/>
+          <w:bCs/>
+        </w:rPr>
+        <w:t xml:space="preserve"> Live Crypto Price Tracker</w:t>
+      </w:r>
+    </w:p>
+    <w:p>
       <w:proofErr w:type="spellStart"/>
       <w:r>
-        <w:t>Snowtrace</w:t>
+        <w:t>DApp</w:t>
       </w:r>
       <w:proofErr w:type="spellEnd"/>
       <w:r>
-        <w:t xml:space="preserve"> link with transaction history. Built on the Avalanche Fuji </w:t>
-      </w:r>
-      <w:proofErr w:type="spellStart"/>
-      <w:r>
-        <w:t>Testnet</w:t>
-      </w:r>
-      <w:proofErr w:type="spellEnd"/>
-      <w:r>
-        <w:t>.</w:t>
+        <w:t xml:space="preserve"> that shows real-time prices of ETH and BTC with gas tracking. Built using Web3.js, responsive UI, and public crypto APIs.</w:t>
       </w:r>
     </w:p>
     <w:p>
@@ -501,76 +642,6 @@
           <w:b/>
           <w:bCs/>
         </w:rPr>
-        <w:t xml:space="preserve"> Lottery </w:t>
-      </w:r>
-      <w:proofErr w:type="spellStart"/>
-      <w:r>
-        <w:rPr>
-          <w:b/>
-          <w:bCs/>
-        </w:rPr>
-        <w:t>DApp</w:t>
-      </w:r>
-      <w:proofErr w:type="spellEnd"/>
-    </w:p>
-    <w:p>
-      <w:r>
-        <w:t>Smart contract-powered lottery system where users buy tickets and a random winner is selected. Includes live wallet interaction and on-chain logic.</w:t>
-      </w:r>
-    </w:p>
-    <w:p>
-      <w:pPr>
-        <w:rPr>
-          <w:b/>
-          <w:bCs/>
-        </w:rPr>
-      </w:pPr>
-      <w:r>
-        <w:rPr>
-          <w:rFonts w:ascii="Segoe UI Emoji" w:hAnsi="Segoe UI Emoji" w:cs="Segoe UI Emoji"/>
-          <w:b/>
-          <w:bCs/>
-        </w:rPr>
-        <w:t>🔹</w:t>
-      </w:r>
-      <w:r>
-        <w:rPr>
-          <w:b/>
-          <w:bCs/>
-        </w:rPr>
-        <w:t xml:space="preserve"> Live Crypto Price Tracker</w:t>
-      </w:r>
-    </w:p>
-    <w:p>
-      <w:proofErr w:type="spellStart"/>
-      <w:r>
-        <w:t>DApp</w:t>
-      </w:r>
-      <w:proofErr w:type="spellEnd"/>
-      <w:r>
-        <w:t xml:space="preserve"> that shows real-time prices of ETH and BTC with gas tracking. Built using Web3.js, responsive UI, and public crypto APIs.</w:t>
-      </w:r>
-    </w:p>
-    <w:p>
-      <w:pPr>
-        <w:rPr>
-          <w:b/>
-          <w:bCs/>
-        </w:rPr>
-      </w:pPr>
-      <w:r>
-        <w:rPr>
-          <w:rFonts w:ascii="Segoe UI Emoji" w:hAnsi="Segoe UI Emoji" w:cs="Segoe UI Emoji"/>
-          <w:b/>
-          <w:bCs/>
-        </w:rPr>
-        <w:t>🔹</w:t>
-      </w:r>
-      <w:r>
-        <w:rPr>
-          <w:b/>
-          <w:bCs/>
-        </w:rPr>
         <w:t xml:space="preserve"> Crypto Swap Calculator</w:t>
       </w:r>
     </w:p>
@@ -596,7 +667,7 @@
         </w:rPr>
         <w:t xml:space="preserve"> </w:t>
       </w:r>
-      <w:hyperlink r:id="rId10" w:history="1">
+      <w:hyperlink r:id="rId12" w:history="1">
         <w:r>
           <w:rPr>
             <w:rStyle w:val="Hyperlink"/>

</xml_diff>